<commit_message>
. videos and graphs
</commit_message>
<xml_diff>
--- a/frontend/deliverables/source/CHL0200_InvestmentChallenge_PeerEvaluationForm.docx
+++ b/frontend/deliverables/source/CHL0200_InvestmentChallenge_PeerEvaluationForm.docx
@@ -137,17 +137,7 @@
                 <w:sz w:val="24"/>
                 <w:szCs w:val="24"/>
               </w:rPr>
-              <w:t>Peer Evaluation Form</w:t>
-            </w:r>
-            <w:r>
-              <w:rPr>
-                <w:rFonts w:ascii="Arial" w:eastAsia="Times New Roman" w:hAnsi="Arial" w:cs="Arial"/>
-                <w:b/>
-                <w:bCs/>
-                <w:sz w:val="24"/>
-                <w:szCs w:val="24"/>
-              </w:rPr>
-              <w:t xml:space="preserve"> public</w:t>
+              <w:t>Peer Evaluation Form (Confidential)</w:t>
             </w:r>
           </w:p>
           <w:p>
@@ -860,8 +850,6 @@
       </w:tr>
       <w:tr>
         <w:trPr>
-          <w:gridAfter w:val="6"/>
-          <w:wAfter w:w="11728" w:type="dxa"/>
           <w:trHeight w:val="955"/>
         </w:trPr>
         <w:tc>
@@ -899,14 +887,196 @@
                 <w:szCs w:val="24"/>
               </w:rPr>
               <w:t>Group Members</w:t>
+            </w:r>
+          </w:p>
+        </w:tc>
+        <w:tc>
+          <w:tcPr>
+            <w:tcW w:w="3790" w:type="dxa"/>
+            <w:tcBorders>
+              <w:top w:val="single" w:sz="4" w:space="0" w:color="auto"/>
+              <w:left w:val="single" w:sz="4" w:space="0" w:color="auto"/>
+              <w:bottom w:val="single" w:sz="4" w:space="0" w:color="000000"/>
+              <w:right w:val="single" w:sz="4" w:space="0" w:color="auto"/>
+            </w:tcBorders>
+            <w:vAlign w:val="center"/>
+            <w:hideMark/>
+          </w:tcPr>
+          <w:p>
+            <w:pPr>
+              <w:spacing w:after="0" w:line="240" w:lineRule="auto"/>
+              <w:jc w:val="center"/>
+              <w:rPr>
+                <w:rFonts w:ascii="Arial" w:eastAsia="Times New Roman" w:hAnsi="Arial" w:cs="Arial"/>
+                <w:b/>
+                <w:bCs/>
+                <w:sz w:val="24"/>
+                <w:szCs w:val="24"/>
+              </w:rPr>
+            </w:pPr>
+            <w:r>
+              <w:rPr>
+                <w:rFonts w:ascii="Arial" w:eastAsia="Times New Roman" w:hAnsi="Arial" w:cs="Arial"/>
+                <w:b/>
+                <w:bCs/>
+                <w:sz w:val="24"/>
+                <w:szCs w:val="24"/>
+              </w:rPr>
+              <w:t xml:space="preserve">What were the primary responsibility in the </w:t>
+            </w:r>
+            <w:r>
+              <w:rPr>
+                <w:rFonts w:ascii="Arial" w:eastAsia="Times New Roman" w:hAnsi="Arial" w:cs="Arial"/>
+                <w:b/>
+                <w:bCs/>
+                <w:sz w:val="24"/>
+                <w:szCs w:val="24"/>
+              </w:rPr>
+              <w:t>simulation</w:t>
+            </w:r>
+            <w:r>
+              <w:rPr>
+                <w:rFonts w:ascii="Arial" w:eastAsia="Times New Roman" w:hAnsi="Arial" w:cs="Arial"/>
+                <w:b/>
+                <w:bCs/>
+                <w:sz w:val="24"/>
+                <w:szCs w:val="24"/>
+              </w:rPr>
+              <w:t>?</w:t>
+            </w:r>
+          </w:p>
+        </w:tc>
+        <w:tc>
+          <w:tcPr>
+            <w:tcW w:w="2591" w:type="dxa"/>
+            <w:tcBorders>
+              <w:top w:val="single" w:sz="4" w:space="0" w:color="auto"/>
+              <w:left w:val="nil"/>
+              <w:bottom w:val="single" w:sz="4" w:space="0" w:color="auto"/>
+              <w:right w:val="single" w:sz="4" w:space="0" w:color="auto"/>
+            </w:tcBorders>
+            <w:vAlign w:val="center"/>
+          </w:tcPr>
+          <w:p>
+            <w:pPr>
+              <w:spacing w:after="0" w:line="240" w:lineRule="auto"/>
+              <w:jc w:val="center"/>
+              <w:rPr>
+                <w:rFonts w:ascii="Arial" w:eastAsia="Times New Roman" w:hAnsi="Arial" w:cs="Arial"/>
+                <w:b/>
+                <w:bCs/>
+                <w:sz w:val="24"/>
+                <w:szCs w:val="24"/>
+              </w:rPr>
+            </w:pPr>
+            <w:r>
+              <w:rPr>
+                <w:rFonts w:ascii="Arial" w:eastAsia="Times New Roman" w:hAnsi="Arial" w:cs="Arial"/>
+                <w:b/>
+                <w:bCs/>
+                <w:sz w:val="24"/>
+                <w:szCs w:val="24"/>
+              </w:rPr>
+              <w:t>Strength</w:t>
+            </w:r>
+          </w:p>
+        </w:tc>
+        <w:tc>
+          <w:tcPr>
+            <w:tcW w:w="4082" w:type="dxa"/>
+            <w:gridSpan w:val="3"/>
+            <w:tcBorders>
+              <w:top w:val="single" w:sz="4" w:space="0" w:color="auto"/>
+              <w:left w:val="single" w:sz="4" w:space="0" w:color="auto"/>
+              <w:bottom w:val="single" w:sz="4" w:space="0" w:color="auto"/>
+              <w:right w:val="single" w:sz="4" w:space="0" w:color="auto"/>
+            </w:tcBorders>
+            <w:vAlign w:val="center"/>
+          </w:tcPr>
+          <w:p>
+            <w:pPr>
+              <w:spacing w:after="0" w:line="240" w:lineRule="auto"/>
+              <w:jc w:val="center"/>
+              <w:rPr>
+                <w:rFonts w:ascii="Arial" w:eastAsia="Times New Roman" w:hAnsi="Arial" w:cs="Arial"/>
+                <w:b/>
+                <w:bCs/>
+                <w:sz w:val="24"/>
+                <w:szCs w:val="24"/>
+              </w:rPr>
+            </w:pPr>
+            <w:r>
+              <w:rPr>
+                <w:rFonts w:ascii="Arial" w:eastAsia="Times New Roman" w:hAnsi="Arial" w:cs="Arial"/>
+                <w:b/>
+                <w:bCs/>
+                <w:sz w:val="24"/>
+                <w:szCs w:val="24"/>
+              </w:rPr>
+              <w:t>Weaknesses</w:t>
+            </w:r>
+          </w:p>
+        </w:tc>
+        <w:tc>
+          <w:tcPr>
+            <w:tcW w:w="1265" w:type="dxa"/>
+            <w:tcBorders>
+              <w:top w:val="single" w:sz="4" w:space="0" w:color="auto"/>
+              <w:left w:val="single" w:sz="4" w:space="0" w:color="auto"/>
+              <w:right w:val="single" w:sz="4" w:space="0" w:color="auto"/>
+            </w:tcBorders>
+            <w:vAlign w:val="center"/>
+          </w:tcPr>
+          <w:p>
+            <w:pPr>
+              <w:spacing w:after="0" w:line="240" w:lineRule="auto"/>
+              <w:jc w:val="center"/>
+              <w:rPr>
+                <w:rFonts w:ascii="Arial" w:eastAsia="Times New Roman" w:hAnsi="Arial" w:cs="Arial"/>
+                <w:b/>
+                <w:bCs/>
+                <w:sz w:val="24"/>
+                <w:szCs w:val="24"/>
+              </w:rPr>
+            </w:pPr>
+            <w:r>
+              <w:rPr>
+                <w:rFonts w:ascii="Arial" w:eastAsia="Times New Roman" w:hAnsi="Arial" w:cs="Arial"/>
+                <w:b/>
+                <w:bCs/>
+                <w:sz w:val="24"/>
+                <w:szCs w:val="24"/>
+              </w:rPr>
+              <w:t>Points given</w:t>
+            </w:r>
+          </w:p>
+          <w:p>
+            <w:pPr>
+              <w:spacing w:after="0" w:line="240" w:lineRule="auto"/>
+              <w:jc w:val="center"/>
+              <w:rPr>
+                <w:rFonts w:ascii="Arial" w:eastAsia="Times New Roman" w:hAnsi="Arial" w:cs="Arial"/>
+                <w:b/>
+                <w:bCs/>
+                <w:sz w:val="24"/>
+                <w:szCs w:val="24"/>
+              </w:rPr>
+            </w:pPr>
+            <w:r>
+              <w:rPr>
+                <w:rFonts w:ascii="Arial" w:eastAsia="Times New Roman" w:hAnsi="Arial" w:cs="Arial"/>
+                <w:b/>
+                <w:bCs/>
+                <w:sz w:val="24"/>
+                <w:szCs w:val="24"/>
+              </w:rPr>
+              <w:t>(out of 100)</w:t>
             </w:r>
           </w:p>
         </w:tc>
       </w:tr>
       <w:tr>
         <w:trPr>
-          <w:gridAfter w:val="6"/>
-          <w:wAfter w:w="11728" w:type="dxa"/>
           <w:trHeight w:val="600"/>
         </w:trPr>
         <w:tc>
@@ -968,14 +1138,138 @@
                 <w:szCs w:val="24"/>
               </w:rPr>
               <w:t>Kartavya Jharwal (Team Lead)</w:t>
+            </w:r>
+          </w:p>
+        </w:tc>
+        <w:tc>
+          <w:tcPr>
+            <w:tcW w:w="3790" w:type="dxa"/>
+            <w:tcBorders>
+              <w:top w:val="nil"/>
+              <w:left w:val="nil"/>
+              <w:bottom w:val="single" w:sz="4" w:space="0" w:color="auto"/>
+              <w:right w:val="single" w:sz="4" w:space="0" w:color="auto"/>
+            </w:tcBorders>
+            <w:noWrap/>
+            <w:vAlign w:val="center"/>
+          </w:tcPr>
+          <w:p>
+            <w:pPr>
+              <w:spacing w:after="0" w:line="240" w:lineRule="auto"/>
+              <w:rPr>
+                <w:rFonts w:ascii="Arial" w:eastAsia="Times New Roman" w:hAnsi="Arial" w:cs="Arial"/>
+                <w:sz w:val="24"/>
+                <w:szCs w:val="24"/>
+                <w:highlight w:val="black"/>
+              </w:rPr>
+            </w:pPr>
+            <w:r>
+              <w:rPr>
+                <w:sz w:val="24"/>
+                <w:szCs w:val="24"/>
+              </w:rPr>
+              <w:t>Led the strategy, coordinated the team, and kept the simulation moving in the same direction.</w:t>
+            </w:r>
+          </w:p>
+        </w:tc>
+        <w:tc>
+          <w:tcPr>
+            <w:tcW w:w="2591" w:type="dxa"/>
+            <w:tcBorders>
+              <w:top w:val="single" w:sz="4" w:space="0" w:color="auto"/>
+              <w:left w:val="nil"/>
+              <w:bottom w:val="single" w:sz="4" w:space="0" w:color="auto"/>
+              <w:right w:val="single" w:sz="4" w:space="0" w:color="auto"/>
+            </w:tcBorders>
+            <w:noWrap/>
+            <w:vAlign w:val="center"/>
+            <w:hideMark/>
+          </w:tcPr>
+          <w:p>
+            <w:pPr>
+              <w:spacing w:after="0" w:line="240" w:lineRule="auto"/>
+              <w:rPr>
+                <w:rFonts w:ascii="Arial" w:eastAsia="Times New Roman" w:hAnsi="Arial" w:cs="Arial"/>
+                <w:sz w:val="24"/>
+                <w:szCs w:val="24"/>
+              </w:rPr>
+            </w:pPr>
+            <w:r>
+              <w:rPr>
+                <w:sz w:val="24"/>
+                <w:szCs w:val="24"/>
+              </w:rPr>
+              <w:t>Strong leadership, high ownership, and clear standards for both analysis and deliverables.</w:t>
+            </w:r>
+          </w:p>
+        </w:tc>
+        <w:tc>
+          <w:tcPr>
+            <w:tcW w:w="4082" w:type="dxa"/>
+            <w:gridSpan w:val="3"/>
+            <w:tcBorders>
+              <w:top w:val="single" w:sz="4" w:space="0" w:color="auto"/>
+              <w:left w:val="single" w:sz="4" w:space="0" w:color="auto"/>
+              <w:bottom w:val="single" w:sz="4" w:space="0" w:color="auto"/>
+              <w:right w:val="single" w:sz="4" w:space="0" w:color="auto"/>
+            </w:tcBorders>
+            <w:noWrap/>
+            <w:vAlign w:val="center"/>
+            <w:hideMark/>
+          </w:tcPr>
+          <w:p>
+            <w:pPr>
+              <w:spacing w:after="0" w:line="240" w:lineRule="auto"/>
+              <w:rPr>
+                <w:rFonts w:ascii="Arial" w:eastAsia="Times New Roman" w:hAnsi="Arial" w:cs="Arial"/>
+                <w:sz w:val="24"/>
+                <w:szCs w:val="24"/>
+              </w:rPr>
+            </w:pPr>
+            <w:r>
+              <w:rPr>
+                <w:sz w:val="24"/>
+                <w:szCs w:val="24"/>
+              </w:rPr>
+              <w:t>Carried a very heavy share of the workload because many others depended on direction.</w:t>
+            </w:r>
+          </w:p>
+        </w:tc>
+        <w:tc>
+          <w:tcPr>
+            <w:tcW w:w="1265" w:type="dxa"/>
+            <w:tcBorders>
+              <w:top w:val="single" w:sz="4" w:space="0" w:color="auto"/>
+              <w:left w:val="single" w:sz="4" w:space="0" w:color="auto"/>
+              <w:bottom w:val="single" w:sz="4" w:space="0" w:color="auto"/>
+              <w:right w:val="single" w:sz="4" w:space="0" w:color="auto"/>
+            </w:tcBorders>
+            <w:noWrap/>
+            <w:vAlign w:val="center"/>
+            <w:hideMark/>
+          </w:tcPr>
+          <w:p>
+            <w:pPr>
+              <w:spacing w:after="0" w:line="240" w:lineRule="auto"/>
+              <w:jc w:val="center"/>
+              <w:rPr>
+                <w:rFonts w:ascii="Arial" w:eastAsia="Times New Roman" w:hAnsi="Arial" w:cs="Arial"/>
+                <w:sz w:val="36"/>
+                <w:szCs w:val="36"/>
+              </w:rPr>
+            </w:pPr>
+            <w:r>
+              <w:rPr>
+                <w:sz w:val="36"/>
+                <w:szCs w:val="36"/>
+              </w:rPr>
+              <w:t>100</w:t>
             </w:r>
           </w:p>
         </w:tc>
       </w:tr>
       <w:tr>
         <w:trPr>
-          <w:gridAfter w:val="6"/>
-          <w:wAfter w:w="11728" w:type="dxa"/>
           <w:trHeight w:val="600"/>
         </w:trPr>
         <w:tc>
@@ -1037,14 +1331,138 @@
                 <w:szCs w:val="24"/>
               </w:rPr>
               <w:t>Aliah Muhammad Asharaf</w:t>
+            </w:r>
+          </w:p>
+        </w:tc>
+        <w:tc>
+          <w:tcPr>
+            <w:tcW w:w="3790" w:type="dxa"/>
+            <w:tcBorders>
+              <w:top w:val="nil"/>
+              <w:left w:val="nil"/>
+              <w:bottom w:val="single" w:sz="4" w:space="0" w:color="auto"/>
+              <w:right w:val="single" w:sz="4" w:space="0" w:color="auto"/>
+            </w:tcBorders>
+            <w:noWrap/>
+            <w:vAlign w:val="center"/>
+            <w:hideMark/>
+          </w:tcPr>
+          <w:p>
+            <w:pPr>
+              <w:spacing w:after="0" w:line="240" w:lineRule="auto"/>
+              <w:rPr>
+                <w:rFonts w:ascii="Arial" w:eastAsia="Times New Roman" w:hAnsi="Arial" w:cs="Arial"/>
+                <w:sz w:val="24"/>
+                <w:szCs w:val="24"/>
+              </w:rPr>
+            </w:pPr>
+            <w:r>
+              <w:rPr>
+                <w:sz w:val="24"/>
+                <w:szCs w:val="24"/>
+              </w:rPr>
+              <w:t>Managed the trading log, bookkeeping, and documentation of trade rationales, actions, and prices.</w:t>
+            </w:r>
+          </w:p>
+        </w:tc>
+        <w:tc>
+          <w:tcPr>
+            <w:tcW w:w="2591" w:type="dxa"/>
+            <w:tcBorders>
+              <w:top w:val="single" w:sz="4" w:space="0" w:color="auto"/>
+              <w:left w:val="nil"/>
+              <w:bottom w:val="single" w:sz="4" w:space="0" w:color="auto"/>
+              <w:right w:val="single" w:sz="4" w:space="0" w:color="auto"/>
+            </w:tcBorders>
+            <w:noWrap/>
+            <w:vAlign w:val="center"/>
+            <w:hideMark/>
+          </w:tcPr>
+          <w:p>
+            <w:pPr>
+              <w:spacing w:after="0" w:line="240" w:lineRule="auto"/>
+              <w:rPr>
+                <w:rFonts w:ascii="Arial" w:eastAsia="Times New Roman" w:hAnsi="Arial" w:cs="Arial"/>
+                <w:sz w:val="24"/>
+                <w:szCs w:val="24"/>
+              </w:rPr>
+            </w:pPr>
+            <w:r>
+              <w:rPr>
+                <w:sz w:val="24"/>
+                <w:szCs w:val="24"/>
+              </w:rPr>
+              <w:t>Very strong on documentation, clarity, and making finance content accessible to non-finance readers.</w:t>
+            </w:r>
+          </w:p>
+        </w:tc>
+        <w:tc>
+          <w:tcPr>
+            <w:tcW w:w="4082" w:type="dxa"/>
+            <w:gridSpan w:val="3"/>
+            <w:tcBorders>
+              <w:top w:val="single" w:sz="4" w:space="0" w:color="auto"/>
+              <w:left w:val="single" w:sz="4" w:space="0" w:color="auto"/>
+              <w:bottom w:val="single" w:sz="4" w:space="0" w:color="auto"/>
+              <w:right w:val="single" w:sz="4" w:space="0" w:color="auto"/>
+            </w:tcBorders>
+            <w:noWrap/>
+            <w:vAlign w:val="center"/>
+            <w:hideMark/>
+          </w:tcPr>
+          <w:p>
+            <w:pPr>
+              <w:spacing w:after="0" w:line="240" w:lineRule="auto"/>
+              <w:rPr>
+                <w:rFonts w:ascii="Arial" w:eastAsia="Times New Roman" w:hAnsi="Arial" w:cs="Arial"/>
+                <w:sz w:val="24"/>
+                <w:szCs w:val="24"/>
+              </w:rPr>
+            </w:pPr>
+            <w:r>
+              <w:rPr>
+                <w:sz w:val="24"/>
+                <w:szCs w:val="24"/>
+              </w:rPr>
+              <w:t>Less involved in live investment decision-making than in written and clerical execution.</w:t>
+            </w:r>
+          </w:p>
+        </w:tc>
+        <w:tc>
+          <w:tcPr>
+            <w:tcW w:w="1265" w:type="dxa"/>
+            <w:tcBorders>
+              <w:top w:val="single" w:sz="4" w:space="0" w:color="auto"/>
+              <w:left w:val="single" w:sz="4" w:space="0" w:color="auto"/>
+              <w:bottom w:val="single" w:sz="4" w:space="0" w:color="auto"/>
+              <w:right w:val="single" w:sz="4" w:space="0" w:color="auto"/>
+            </w:tcBorders>
+            <w:noWrap/>
+            <w:vAlign w:val="center"/>
+            <w:hideMark/>
+          </w:tcPr>
+          <w:p>
+            <w:pPr>
+              <w:spacing w:after="0" w:line="240" w:lineRule="auto"/>
+              <w:jc w:val="center"/>
+              <w:rPr>
+                <w:rFonts w:ascii="Arial" w:eastAsia="Times New Roman" w:hAnsi="Arial" w:cs="Arial"/>
+                <w:sz w:val="36"/>
+                <w:szCs w:val="36"/>
+              </w:rPr>
+            </w:pPr>
+            <w:r>
+              <w:rPr>
+                <w:sz w:val="36"/>
+                <w:szCs w:val="36"/>
+              </w:rPr>
+              <w:t>98</w:t>
             </w:r>
           </w:p>
         </w:tc>
       </w:tr>
       <w:tr>
         <w:trPr>
-          <w:gridAfter w:val="6"/>
-          <w:wAfter w:w="11728" w:type="dxa"/>
           <w:trHeight w:val="600"/>
         </w:trPr>
         <w:tc>
@@ -1106,14 +1524,145 @@
                 <w:szCs w:val="24"/>
               </w:rPr>
               <w:t>Devarya Shah</w:t>
+            </w:r>
+          </w:p>
+        </w:tc>
+        <w:tc>
+          <w:tcPr>
+            <w:tcW w:w="3790" w:type="dxa"/>
+            <w:tcBorders>
+              <w:top w:val="nil"/>
+              <w:left w:val="nil"/>
+              <w:bottom w:val="single" w:sz="4" w:space="0" w:color="auto"/>
+              <w:right w:val="single" w:sz="4" w:space="0" w:color="auto"/>
+            </w:tcBorders>
+            <w:noWrap/>
+            <w:vAlign w:val="center"/>
+            <w:hideMark/>
+          </w:tcPr>
+          <w:p>
+            <w:pPr>
+              <w:spacing w:after="0" w:line="240" w:lineRule="auto"/>
+              <w:rPr>
+                <w:rFonts w:ascii="Arial" w:eastAsia="Times New Roman" w:hAnsi="Arial" w:cs="Arial"/>
+                <w:sz w:val="24"/>
+                <w:szCs w:val="24"/>
+              </w:rPr>
+            </w:pPr>
+            <w:r>
+              <w:rPr>
+                <w:sz w:val="24"/>
+                <w:szCs w:val="24"/>
+              </w:rPr>
+              <w:t>Helped with report refinement and presentation support.</w:t>
+            </w:r>
+          </w:p>
+        </w:tc>
+        <w:tc>
+          <w:tcPr>
+            <w:tcW w:w="2591" w:type="dxa"/>
+            <w:tcBorders>
+              <w:top w:val="single" w:sz="4" w:space="0" w:color="auto"/>
+              <w:left w:val="nil"/>
+              <w:bottom w:val="single" w:sz="4" w:space="0" w:color="auto"/>
+              <w:right w:val="single" w:sz="4" w:space="0" w:color="auto"/>
+            </w:tcBorders>
+            <w:noWrap/>
+            <w:vAlign w:val="center"/>
+            <w:hideMark/>
+          </w:tcPr>
+          <w:p>
+            <w:pPr>
+              <w:spacing w:after="0" w:line="240" w:lineRule="auto"/>
+              <w:rPr>
+                <w:rFonts w:ascii="Arial" w:eastAsia="Times New Roman" w:hAnsi="Arial" w:cs="Arial"/>
+                <w:sz w:val="24"/>
+                <w:szCs w:val="24"/>
+              </w:rPr>
+            </w:pPr>
+            <w:r>
+              <w:rPr>
+                <w:sz w:val="24"/>
+                <w:szCs w:val="24"/>
+              </w:rPr>
+              <w:t>Good support on structure, editing, and polishing the final output.</w:t>
+            </w:r>
+          </w:p>
+        </w:tc>
+        <w:tc>
+          <w:tcPr>
+            <w:tcW w:w="4082" w:type="dxa"/>
+            <w:gridSpan w:val="3"/>
+            <w:tcBorders>
+              <w:top w:val="single" w:sz="4" w:space="0" w:color="auto"/>
+              <w:left w:val="single" w:sz="4" w:space="0" w:color="auto"/>
+              <w:bottom w:val="single" w:sz="4" w:space="0" w:color="auto"/>
+              <w:right w:val="single" w:sz="4" w:space="0" w:color="auto"/>
+            </w:tcBorders>
+            <w:noWrap/>
+            <w:vAlign w:val="center"/>
+            <w:hideMark/>
+          </w:tcPr>
+          <w:p>
+            <w:pPr>
+              <w:spacing w:after="0" w:line="240" w:lineRule="auto"/>
+              <w:rPr>
+                <w:rFonts w:ascii="Arial" w:eastAsia="Times New Roman" w:hAnsi="Arial" w:cs="Arial"/>
+                <w:sz w:val="24"/>
+                <w:szCs w:val="24"/>
+              </w:rPr>
+            </w:pPr>
+            <w:r>
+              <w:rPr>
+                <w:sz w:val="24"/>
+                <w:szCs w:val="24"/>
+              </w:rPr>
+              <w:t>Minor delivery issue and a small technical slip during presentation.</w:t>
+            </w:r>
+          </w:p>
+        </w:tc>
+        <w:tc>
+          <w:tcPr>
+            <w:tcW w:w="1265" w:type="dxa"/>
+            <w:tcBorders>
+              <w:top w:val="single" w:sz="4" w:space="0" w:color="auto"/>
+              <w:left w:val="single" w:sz="4" w:space="0" w:color="auto"/>
+              <w:bottom w:val="single" w:sz="4" w:space="0" w:color="auto"/>
+              <w:right w:val="single" w:sz="4" w:space="0" w:color="auto"/>
+            </w:tcBorders>
+            <w:noWrap/>
+            <w:vAlign w:val="center"/>
+            <w:hideMark/>
+          </w:tcPr>
+          <w:p>
+            <w:pPr>
+              <w:spacing w:after="0" w:line="240" w:lineRule="auto"/>
+              <w:jc w:val="center"/>
+              <w:rPr>
+                <w:rFonts w:ascii="Arial" w:eastAsia="Times New Roman" w:hAnsi="Arial" w:cs="Arial"/>
+                <w:sz w:val="36"/>
+                <w:szCs w:val="36"/>
+              </w:rPr>
+            </w:pPr>
+            <w:r>
+              <w:rPr>
+                <w:sz w:val="36"/>
+                <w:szCs w:val="36"/>
+              </w:rPr>
+              <w:t>9</w:t>
+            </w:r>
+            <w:r>
+              <w:rPr>
+                <w:sz w:val="36"/>
+                <w:szCs w:val="36"/>
+              </w:rPr>
+              <w:t>9</w:t>
             </w:r>
           </w:p>
         </w:tc>
       </w:tr>
       <w:tr>
         <w:trPr>
-          <w:gridAfter w:val="6"/>
-          <w:wAfter w:w="11728" w:type="dxa"/>
           <w:trHeight w:val="600"/>
         </w:trPr>
         <w:tc>
@@ -1175,14 +1724,138 @@
                 <w:szCs w:val="24"/>
               </w:rPr>
               <w:t>Nandini Prakash Rangani</w:t>
+            </w:r>
+          </w:p>
+        </w:tc>
+        <w:tc>
+          <w:tcPr>
+            <w:tcW w:w="3790" w:type="dxa"/>
+            <w:tcBorders>
+              <w:top w:val="nil"/>
+              <w:left w:val="nil"/>
+              <w:bottom w:val="single" w:sz="4" w:space="0" w:color="auto"/>
+              <w:right w:val="single" w:sz="4" w:space="0" w:color="auto"/>
+            </w:tcBorders>
+            <w:noWrap/>
+            <w:vAlign w:val="center"/>
+            <w:hideMark/>
+          </w:tcPr>
+          <w:p>
+            <w:pPr>
+              <w:spacing w:after="0" w:line="240" w:lineRule="auto"/>
+              <w:rPr>
+                <w:rFonts w:ascii="Arial" w:eastAsia="Times New Roman" w:hAnsi="Arial" w:cs="Arial"/>
+                <w:sz w:val="24"/>
+                <w:szCs w:val="24"/>
+              </w:rPr>
+            </w:pPr>
+            <w:r>
+              <w:rPr>
+                <w:sz w:val="24"/>
+                <w:szCs w:val="24"/>
+              </w:rPr>
+              <w:t>Supported the presentation and deck design side of the project.</w:t>
+            </w:r>
+          </w:p>
+        </w:tc>
+        <w:tc>
+          <w:tcPr>
+            <w:tcW w:w="2591" w:type="dxa"/>
+            <w:tcBorders>
+              <w:top w:val="single" w:sz="4" w:space="0" w:color="auto"/>
+              <w:left w:val="nil"/>
+              <w:bottom w:val="single" w:sz="4" w:space="0" w:color="auto"/>
+              <w:right w:val="single" w:sz="4" w:space="0" w:color="auto"/>
+            </w:tcBorders>
+            <w:noWrap/>
+            <w:vAlign w:val="center"/>
+            <w:hideMark/>
+          </w:tcPr>
+          <w:p>
+            <w:pPr>
+              <w:spacing w:after="0" w:line="240" w:lineRule="auto"/>
+              <w:rPr>
+                <w:rFonts w:ascii="Arial" w:eastAsia="Times New Roman" w:hAnsi="Arial" w:cs="Arial"/>
+                <w:sz w:val="24"/>
+                <w:szCs w:val="24"/>
+              </w:rPr>
+            </w:pPr>
+            <w:r>
+              <w:rPr>
+                <w:sz w:val="24"/>
+                <w:szCs w:val="24"/>
+              </w:rPr>
+              <w:t>Strong on visual communication and making the deck clear and professional.</w:t>
+            </w:r>
+          </w:p>
+        </w:tc>
+        <w:tc>
+          <w:tcPr>
+            <w:tcW w:w="4082" w:type="dxa"/>
+            <w:gridSpan w:val="3"/>
+            <w:tcBorders>
+              <w:top w:val="single" w:sz="4" w:space="0" w:color="auto"/>
+              <w:left w:val="single" w:sz="4" w:space="0" w:color="auto"/>
+              <w:bottom w:val="single" w:sz="4" w:space="0" w:color="auto"/>
+              <w:right w:val="single" w:sz="4" w:space="0" w:color="auto"/>
+            </w:tcBorders>
+            <w:noWrap/>
+            <w:vAlign w:val="center"/>
+            <w:hideMark/>
+          </w:tcPr>
+          <w:p>
+            <w:pPr>
+              <w:spacing w:after="0" w:line="240" w:lineRule="auto"/>
+              <w:rPr>
+                <w:rFonts w:ascii="Arial" w:eastAsia="Times New Roman" w:hAnsi="Arial" w:cs="Arial"/>
+                <w:sz w:val="24"/>
+                <w:szCs w:val="24"/>
+              </w:rPr>
+            </w:pPr>
+            <w:r>
+              <w:rPr>
+                <w:sz w:val="24"/>
+                <w:szCs w:val="24"/>
+              </w:rPr>
+              <w:t>More focused on the presentation layer than on the deeper investment analysis.</w:t>
+            </w:r>
+          </w:p>
+        </w:tc>
+        <w:tc>
+          <w:tcPr>
+            <w:tcW w:w="1265" w:type="dxa"/>
+            <w:tcBorders>
+              <w:top w:val="single" w:sz="4" w:space="0" w:color="auto"/>
+              <w:left w:val="single" w:sz="4" w:space="0" w:color="auto"/>
+              <w:bottom w:val="single" w:sz="4" w:space="0" w:color="auto"/>
+              <w:right w:val="single" w:sz="4" w:space="0" w:color="auto"/>
+            </w:tcBorders>
+            <w:noWrap/>
+            <w:vAlign w:val="center"/>
+            <w:hideMark/>
+          </w:tcPr>
+          <w:p>
+            <w:pPr>
+              <w:spacing w:after="0" w:line="240" w:lineRule="auto"/>
+              <w:jc w:val="center"/>
+              <w:rPr>
+                <w:rFonts w:ascii="Arial" w:eastAsia="Times New Roman" w:hAnsi="Arial" w:cs="Arial"/>
+                <w:sz w:val="36"/>
+                <w:szCs w:val="36"/>
+              </w:rPr>
+            </w:pPr>
+            <w:r>
+              <w:rPr>
+                <w:sz w:val="36"/>
+                <w:szCs w:val="36"/>
+              </w:rPr>
+              <w:t>98</w:t>
             </w:r>
           </w:p>
         </w:tc>
       </w:tr>
       <w:tr>
         <w:trPr>
-          <w:gridAfter w:val="6"/>
-          <w:wAfter w:w="11728" w:type="dxa"/>
           <w:trHeight w:val="600"/>
         </w:trPr>
         <w:tc>
@@ -1243,14 +1916,133 @@
                 <w:szCs w:val="24"/>
               </w:rPr>
               <w:t>Pedro Junqueira</w:t>
+            </w:r>
+          </w:p>
+        </w:tc>
+        <w:tc>
+          <w:tcPr>
+            <w:tcW w:w="3790" w:type="dxa"/>
+            <w:tcBorders>
+              <w:top w:val="nil"/>
+              <w:left w:val="nil"/>
+              <w:bottom w:val="single" w:sz="4" w:space="0" w:color="auto"/>
+              <w:right w:val="single" w:sz="4" w:space="0" w:color="auto"/>
+            </w:tcBorders>
+            <w:noWrap/>
+            <w:vAlign w:val="center"/>
+          </w:tcPr>
+          <w:p>
+            <w:pPr>
+              <w:rPr>
+                <w:rFonts w:ascii="Arial" w:eastAsia="Times New Roman" w:hAnsi="Arial" w:cs="Arial"/>
+                <w:sz w:val="24"/>
+                <w:szCs w:val="24"/>
+              </w:rPr>
+            </w:pPr>
+            <w:r>
+              <w:rPr>
+                <w:sz w:val="24"/>
+                <w:szCs w:val="24"/>
+              </w:rPr>
+              <w:t>Supported the dashboard and AI-assisted analysis work, especially fast-turnaround visuals and models.</w:t>
+            </w:r>
+          </w:p>
+        </w:tc>
+        <w:tc>
+          <w:tcPr>
+            <w:tcW w:w="2591" w:type="dxa"/>
+            <w:tcBorders>
+              <w:top w:val="single" w:sz="4" w:space="0" w:color="auto"/>
+              <w:left w:val="nil"/>
+              <w:bottom w:val="single" w:sz="4" w:space="0" w:color="auto"/>
+              <w:right w:val="single" w:sz="4" w:space="0" w:color="auto"/>
+            </w:tcBorders>
+            <w:noWrap/>
+            <w:vAlign w:val="center"/>
+          </w:tcPr>
+          <w:p>
+            <w:pPr>
+              <w:spacing w:after="0" w:line="240" w:lineRule="auto"/>
+              <w:rPr>
+                <w:rFonts w:ascii="Arial" w:eastAsia="Times New Roman" w:hAnsi="Arial" w:cs="Arial"/>
+                <w:sz w:val="24"/>
+                <w:szCs w:val="24"/>
+              </w:rPr>
+            </w:pPr>
+            <w:r>
+              <w:rPr>
+                <w:sz w:val="24"/>
+                <w:szCs w:val="24"/>
+              </w:rPr>
+              <w:t>High-quality, fast output and useful technical suggestions that improved efficiency.</w:t>
+            </w:r>
+          </w:p>
+        </w:tc>
+        <w:tc>
+          <w:tcPr>
+            <w:tcW w:w="4082" w:type="dxa"/>
+            <w:gridSpan w:val="3"/>
+            <w:tcBorders>
+              <w:top w:val="single" w:sz="4" w:space="0" w:color="auto"/>
+              <w:left w:val="single" w:sz="4" w:space="0" w:color="auto"/>
+              <w:bottom w:val="single" w:sz="4" w:space="0" w:color="auto"/>
+              <w:right w:val="single" w:sz="4" w:space="0" w:color="auto"/>
+            </w:tcBorders>
+            <w:noWrap/>
+            <w:vAlign w:val="center"/>
+          </w:tcPr>
+          <w:p>
+            <w:pPr>
+              <w:spacing w:after="0" w:line="240" w:lineRule="auto"/>
+              <w:rPr>
+                <w:rFonts w:ascii="Arial" w:eastAsia="Times New Roman" w:hAnsi="Arial" w:cs="Arial"/>
+                <w:sz w:val="24"/>
+                <w:szCs w:val="24"/>
+              </w:rPr>
+            </w:pPr>
+            <w:r>
+              <w:rPr>
+                <w:sz w:val="24"/>
+                <w:szCs w:val="24"/>
+              </w:rPr>
+              <w:t>Relied more on guided support than full ownership of every technical component, which meant less time spent on direct task completion elsewhere.</w:t>
+            </w:r>
+          </w:p>
+        </w:tc>
+        <w:tc>
+          <w:tcPr>
+            <w:tcW w:w="1265" w:type="dxa"/>
+            <w:tcBorders>
+              <w:top w:val="single" w:sz="4" w:space="0" w:color="auto"/>
+              <w:left w:val="single" w:sz="4" w:space="0" w:color="auto"/>
+              <w:bottom w:val="single" w:sz="4" w:space="0" w:color="auto"/>
+              <w:right w:val="single" w:sz="4" w:space="0" w:color="auto"/>
+            </w:tcBorders>
+            <w:noWrap/>
+            <w:vAlign w:val="center"/>
+          </w:tcPr>
+          <w:p>
+            <w:pPr>
+              <w:spacing w:after="0" w:line="240" w:lineRule="auto"/>
+              <w:jc w:val="center"/>
+              <w:rPr>
+                <w:rFonts w:ascii="Arial" w:eastAsia="Times New Roman" w:hAnsi="Arial" w:cs="Arial"/>
+                <w:sz w:val="36"/>
+                <w:szCs w:val="36"/>
+              </w:rPr>
+            </w:pPr>
+            <w:r>
+              <w:rPr>
+                <w:sz w:val="36"/>
+                <w:szCs w:val="36"/>
+              </w:rPr>
+              <w:t>94</w:t>
             </w:r>
           </w:p>
         </w:tc>
       </w:tr>
       <w:tr>
         <w:trPr>
-          <w:gridAfter w:val="6"/>
-          <w:wAfter w:w="11728" w:type="dxa"/>
           <w:trHeight w:val="600"/>
         </w:trPr>
         <w:tc>
@@ -1311,14 +2103,166 @@
                 <w:szCs w:val="24"/>
               </w:rPr>
               <w:t>Abdul Rafay Malik</w:t>
+            </w:r>
+          </w:p>
+        </w:tc>
+        <w:tc>
+          <w:tcPr>
+            <w:tcW w:w="3790" w:type="dxa"/>
+            <w:tcBorders>
+              <w:top w:val="single" w:sz="4" w:space="0" w:color="auto"/>
+              <w:left w:val="single" w:sz="4" w:space="0" w:color="auto"/>
+              <w:bottom w:val="single" w:sz="4" w:space="0" w:color="auto"/>
+              <w:right w:val="single" w:sz="4" w:space="0" w:color="auto"/>
+            </w:tcBorders>
+            <w:noWrap/>
+            <w:vAlign w:val="center"/>
+          </w:tcPr>
+          <w:p>
+            <w:pPr>
+              <w:rPr>
+                <w:rFonts w:ascii="Arial" w:hAnsi="Arial" w:cs="Arial"/>
+                <w:sz w:val="24"/>
+                <w:szCs w:val="24"/>
+              </w:rPr>
+            </w:pPr>
+            <w:r>
+              <w:rPr>
+                <w:sz w:val="24"/>
+                <w:szCs w:val="24"/>
+              </w:rPr>
+              <w:t>Supported branding, client-facing tone, and basic structure of the final presentation.</w:t>
+            </w:r>
+          </w:p>
+        </w:tc>
+        <w:tc>
+          <w:tcPr>
+            <w:tcW w:w="2591" w:type="dxa"/>
+            <w:tcBorders>
+              <w:top w:val="single" w:sz="4" w:space="0" w:color="auto"/>
+              <w:left w:val="nil"/>
+              <w:bottom w:val="single" w:sz="4" w:space="0" w:color="auto"/>
+              <w:right w:val="single" w:sz="4" w:space="0" w:color="auto"/>
+            </w:tcBorders>
+            <w:noWrap/>
+            <w:vAlign w:val="center"/>
+          </w:tcPr>
+          <w:p>
+            <w:pPr>
+              <w:spacing w:after="0" w:line="240" w:lineRule="auto"/>
+              <w:rPr>
+                <w:rFonts w:ascii="Arial" w:eastAsia="Times New Roman" w:hAnsi="Arial" w:cs="Arial"/>
+                <w:sz w:val="24"/>
+                <w:szCs w:val="24"/>
+              </w:rPr>
+            </w:pPr>
+            <w:r>
+              <w:rPr>
+                <w:sz w:val="24"/>
+                <w:szCs w:val="24"/>
+              </w:rPr>
+              <w:t>Useful as a baseline for simplifying ideas and keeping the message understandable.</w:t>
+            </w:r>
+          </w:p>
+        </w:tc>
+        <w:tc>
+          <w:tcPr>
+            <w:tcW w:w="4082" w:type="dxa"/>
+            <w:gridSpan w:val="3"/>
+            <w:tcBorders>
+              <w:top w:val="single" w:sz="4" w:space="0" w:color="auto"/>
+              <w:left w:val="single" w:sz="4" w:space="0" w:color="auto"/>
+              <w:bottom w:val="single" w:sz="4" w:space="0" w:color="auto"/>
+              <w:right w:val="single" w:sz="4" w:space="0" w:color="auto"/>
+            </w:tcBorders>
+            <w:noWrap/>
+            <w:vAlign w:val="center"/>
+          </w:tcPr>
+          <w:p>
+            <w:pPr>
+              <w:spacing w:after="0" w:line="240" w:lineRule="auto"/>
+              <w:rPr>
+                <w:rFonts w:ascii="Arial" w:eastAsia="Times New Roman" w:hAnsi="Arial" w:cs="Arial"/>
+                <w:sz w:val="24"/>
+                <w:szCs w:val="24"/>
+              </w:rPr>
+            </w:pPr>
+            <w:r>
+              <w:rPr>
+                <w:sz w:val="24"/>
+                <w:szCs w:val="24"/>
+              </w:rPr>
+              <w:t>Contributed less to the technical and analytical depth of the project.</w:t>
+            </w:r>
+            <w:r>
+              <w:rPr>
+                <w:sz w:val="24"/>
+                <w:szCs w:val="24"/>
+              </w:rPr>
+              <w:br/>
+            </w:r>
+            <w:r>
+              <w:rPr>
+                <w:rFonts w:ascii="Arial" w:eastAsia="Times New Roman" w:hAnsi="Arial" w:cs="Arial"/>
+                <w:sz w:val="24"/>
+                <w:szCs w:val="24"/>
+              </w:rPr>
+              <w:br/>
+              <w:t xml:space="preserve">One critical factor for a lower grade </w:t>
+            </w:r>
+            <w:r>
+              <w:rPr>
+                <w:rFonts w:ascii="Arial" w:eastAsia="Times New Roman" w:hAnsi="Arial" w:cs="Arial"/>
+                <w:sz w:val="24"/>
+                <w:szCs w:val="24"/>
+              </w:rPr>
+              <w:lastRenderedPageBreak/>
+              <w:t>is too much prying and took an extremist stance oh his peer grade score.</w:t>
+            </w:r>
+          </w:p>
+        </w:tc>
+        <w:tc>
+          <w:tcPr>
+            <w:tcW w:w="1265" w:type="dxa"/>
+            <w:tcBorders>
+              <w:top w:val="single" w:sz="4" w:space="0" w:color="auto"/>
+              <w:left w:val="single" w:sz="4" w:space="0" w:color="auto"/>
+              <w:bottom w:val="single" w:sz="4" w:space="0" w:color="auto"/>
+              <w:right w:val="single" w:sz="4" w:space="0" w:color="auto"/>
+            </w:tcBorders>
+            <w:noWrap/>
+            <w:vAlign w:val="center"/>
+          </w:tcPr>
+          <w:p>
+            <w:pPr>
+              <w:spacing w:after="0" w:line="240" w:lineRule="auto"/>
+              <w:jc w:val="center"/>
+              <w:rPr>
+                <w:rFonts w:ascii="Arial" w:eastAsia="Times New Roman" w:hAnsi="Arial" w:cs="Arial"/>
+                <w:sz w:val="36"/>
+                <w:szCs w:val="36"/>
+              </w:rPr>
+            </w:pPr>
+            <w:r>
+              <w:rPr>
+                <w:sz w:val="36"/>
+                <w:szCs w:val="36"/>
+              </w:rPr>
+              <w:lastRenderedPageBreak/>
+              <w:t>6</w:t>
+            </w:r>
+            <w:r>
+              <w:rPr>
+                <w:sz w:val="36"/>
+                <w:szCs w:val="36"/>
+              </w:rPr>
+              <w:t>9</w:t>
             </w:r>
           </w:p>
         </w:tc>
       </w:tr>
       <w:tr>
         <w:trPr>
-          <w:gridAfter w:val="6"/>
-          <w:wAfter w:w="11728" w:type="dxa"/>
           <w:trHeight w:val="600"/>
         </w:trPr>
         <w:tc>
@@ -1379,14 +2323,142 @@
                 <w:szCs w:val="24"/>
               </w:rPr>
               <w:t>Sayhan Mushrif</w:t>
+            </w:r>
+          </w:p>
+        </w:tc>
+        <w:tc>
+          <w:tcPr>
+            <w:tcW w:w="3790" w:type="dxa"/>
+            <w:tcBorders>
+              <w:top w:val="single" w:sz="4" w:space="0" w:color="auto"/>
+              <w:left w:val="single" w:sz="4" w:space="0" w:color="auto"/>
+              <w:bottom w:val="single" w:sz="4" w:space="0" w:color="auto"/>
+              <w:right w:val="single" w:sz="4" w:space="0" w:color="auto"/>
+            </w:tcBorders>
+            <w:noWrap/>
+            <w:vAlign w:val="center"/>
+          </w:tcPr>
+          <w:p>
+            <w:pPr>
+              <w:rPr>
+                <w:rFonts w:ascii="Arial" w:hAnsi="Arial" w:cs="Arial"/>
+                <w:sz w:val="24"/>
+                <w:szCs w:val="24"/>
+              </w:rPr>
+            </w:pPr>
+            <w:r>
+              <w:rPr>
+                <w:sz w:val="24"/>
+                <w:szCs w:val="24"/>
+              </w:rPr>
+              <w:t>Joined late and completed delegated support tasks such as notes, rehearsal, and script coordination.</w:t>
+            </w:r>
+          </w:p>
+        </w:tc>
+        <w:tc>
+          <w:tcPr>
+            <w:tcW w:w="2591" w:type="dxa"/>
+            <w:tcBorders>
+              <w:top w:val="single" w:sz="4" w:space="0" w:color="auto"/>
+              <w:left w:val="nil"/>
+              <w:bottom w:val="single" w:sz="4" w:space="0" w:color="auto"/>
+              <w:right w:val="single" w:sz="4" w:space="0" w:color="auto"/>
+            </w:tcBorders>
+            <w:noWrap/>
+            <w:vAlign w:val="center"/>
+          </w:tcPr>
+          <w:p>
+            <w:pPr>
+              <w:spacing w:after="0" w:line="240" w:lineRule="auto"/>
+              <w:rPr>
+                <w:rFonts w:ascii="Arial" w:eastAsia="Times New Roman" w:hAnsi="Arial" w:cs="Arial"/>
+                <w:sz w:val="24"/>
+                <w:szCs w:val="24"/>
+              </w:rPr>
+            </w:pPr>
+            <w:r>
+              <w:rPr>
+                <w:sz w:val="24"/>
+                <w:szCs w:val="24"/>
+              </w:rPr>
+              <w:t>Reliable on delegated tasks and helpful where assigned.</w:t>
+            </w:r>
+          </w:p>
+        </w:tc>
+        <w:tc>
+          <w:tcPr>
+            <w:tcW w:w="4082" w:type="dxa"/>
+            <w:gridSpan w:val="3"/>
+            <w:tcBorders>
+              <w:top w:val="single" w:sz="4" w:space="0" w:color="auto"/>
+              <w:left w:val="single" w:sz="4" w:space="0" w:color="auto"/>
+              <w:bottom w:val="single" w:sz="4" w:space="0" w:color="auto"/>
+              <w:right w:val="single" w:sz="4" w:space="0" w:color="auto"/>
+            </w:tcBorders>
+            <w:noWrap/>
+            <w:vAlign w:val="center"/>
+          </w:tcPr>
+          <w:p>
+            <w:pPr>
+              <w:spacing w:after="0" w:line="240" w:lineRule="auto"/>
+              <w:rPr>
+                <w:rFonts w:ascii="Arial" w:eastAsia="Times New Roman" w:hAnsi="Arial" w:cs="Arial"/>
+                <w:sz w:val="24"/>
+                <w:szCs w:val="24"/>
+              </w:rPr>
+            </w:pPr>
+            <w:r>
+              <w:rPr>
+                <w:sz w:val="24"/>
+                <w:szCs w:val="24"/>
+              </w:rPr>
+              <w:t>Limited ownership of core strategy, analysis, or deliverable creation.</w:t>
+            </w:r>
+          </w:p>
+        </w:tc>
+        <w:tc>
+          <w:tcPr>
+            <w:tcW w:w="1265" w:type="dxa"/>
+            <w:tcBorders>
+              <w:top w:val="single" w:sz="4" w:space="0" w:color="auto"/>
+              <w:left w:val="single" w:sz="4" w:space="0" w:color="auto"/>
+              <w:bottom w:val="single" w:sz="4" w:space="0" w:color="auto"/>
+              <w:right w:val="single" w:sz="4" w:space="0" w:color="auto"/>
+            </w:tcBorders>
+            <w:noWrap/>
+            <w:vAlign w:val="center"/>
+          </w:tcPr>
+          <w:p>
+            <w:pPr>
+              <w:spacing w:after="0" w:line="240" w:lineRule="auto"/>
+              <w:jc w:val="center"/>
+              <w:rPr>
+                <w:rFonts w:ascii="Arial" w:eastAsia="Times New Roman" w:hAnsi="Arial" w:cs="Arial"/>
+                <w:sz w:val="36"/>
+                <w:szCs w:val="36"/>
+              </w:rPr>
+            </w:pPr>
+            <w:r>
+              <w:rPr>
+                <w:rFonts w:ascii="Arial" w:eastAsia="Times New Roman" w:hAnsi="Arial" w:cs="Arial"/>
+                <w:sz w:val="36"/>
+                <w:szCs w:val="36"/>
+              </w:rPr>
+              <w:t>8</w:t>
+            </w:r>
+            <w:r>
+              <w:rPr>
+                <w:rFonts w:ascii="Arial" w:eastAsia="Times New Roman" w:hAnsi="Arial" w:cs="Arial"/>
+                <w:sz w:val="36"/>
+                <w:szCs w:val="36"/>
+              </w:rPr>
+              <w:t>5</w:t>
             </w:r>
           </w:p>
         </w:tc>
       </w:tr>
       <w:tr>
         <w:trPr>
-          <w:gridAfter w:val="6"/>
-          <w:wAfter w:w="11728" w:type="dxa"/>
           <w:trHeight w:val="600"/>
         </w:trPr>
         <w:tc>
@@ -1447,6 +2519,160 @@
                 <w:szCs w:val="24"/>
               </w:rPr>
               <w:t>Azriel Fernandes</w:t>
+            </w:r>
+          </w:p>
+        </w:tc>
+        <w:tc>
+          <w:tcPr>
+            <w:tcW w:w="3790" w:type="dxa"/>
+            <w:tcBorders>
+              <w:top w:val="nil"/>
+              <w:left w:val="nil"/>
+              <w:bottom w:val="single" w:sz="4" w:space="0" w:color="auto"/>
+              <w:right w:val="single" w:sz="4" w:space="0" w:color="auto"/>
+            </w:tcBorders>
+            <w:noWrap/>
+            <w:vAlign w:val="center"/>
+          </w:tcPr>
+          <w:p>
+            <w:pPr>
+              <w:spacing w:after="0" w:line="240" w:lineRule="auto"/>
+              <w:rPr>
+                <w:rFonts w:ascii="Arial" w:eastAsia="Times New Roman" w:hAnsi="Arial" w:cs="Arial"/>
+                <w:sz w:val="24"/>
+                <w:szCs w:val="24"/>
+              </w:rPr>
+            </w:pPr>
+            <w:r>
+              <w:rPr>
+                <w:sz w:val="24"/>
+                <w:szCs w:val="24"/>
+              </w:rPr>
+              <w:t>Mainly contributed near the end through presentation support and final delivery.</w:t>
+            </w:r>
+          </w:p>
+        </w:tc>
+        <w:tc>
+          <w:tcPr>
+            <w:tcW w:w="2591" w:type="dxa"/>
+            <w:tcBorders>
+              <w:top w:val="single" w:sz="4" w:space="0" w:color="auto"/>
+              <w:left w:val="nil"/>
+              <w:bottom w:val="single" w:sz="4" w:space="0" w:color="auto"/>
+              <w:right w:val="single" w:sz="4" w:space="0" w:color="auto"/>
+            </w:tcBorders>
+            <w:noWrap/>
+            <w:vAlign w:val="center"/>
+          </w:tcPr>
+          <w:p>
+            <w:pPr>
+              <w:spacing w:after="0" w:line="240" w:lineRule="auto"/>
+              <w:rPr>
+                <w:rFonts w:ascii="Arial" w:eastAsia="Times New Roman" w:hAnsi="Arial" w:cs="Arial"/>
+                <w:sz w:val="24"/>
+                <w:szCs w:val="24"/>
+              </w:rPr>
+            </w:pPr>
+            <w:r>
+              <w:rPr>
+                <w:sz w:val="24"/>
+                <w:szCs w:val="24"/>
+              </w:rPr>
+              <w:t>Good presentation skill and useful in the closing phase.</w:t>
+            </w:r>
+          </w:p>
+        </w:tc>
+        <w:tc>
+          <w:tcPr>
+            <w:tcW w:w="4082" w:type="dxa"/>
+            <w:gridSpan w:val="3"/>
+            <w:tcBorders>
+              <w:top w:val="single" w:sz="4" w:space="0" w:color="auto"/>
+              <w:left w:val="single" w:sz="4" w:space="0" w:color="auto"/>
+              <w:bottom w:val="single" w:sz="4" w:space="0" w:color="auto"/>
+              <w:right w:val="single" w:sz="4" w:space="0" w:color="auto"/>
+            </w:tcBorders>
+            <w:noWrap/>
+            <w:vAlign w:val="center"/>
+          </w:tcPr>
+          <w:p>
+            <w:pPr>
+              <w:spacing w:after="0" w:line="240" w:lineRule="auto"/>
+              <w:rPr>
+                <w:rFonts w:ascii="Arial" w:eastAsia="Times New Roman" w:hAnsi="Arial" w:cs="Arial"/>
+                <w:sz w:val="24"/>
+                <w:szCs w:val="24"/>
+              </w:rPr>
+            </w:pPr>
+            <w:r>
+              <w:rPr>
+                <w:sz w:val="24"/>
+                <w:szCs w:val="24"/>
+              </w:rPr>
+              <w:t>Very limited involvement in the full simulation and minimal participation in core trading or analysis work.</w:t>
+            </w:r>
+            <w:r>
+              <w:rPr>
+                <w:sz w:val="24"/>
+                <w:szCs w:val="24"/>
+              </w:rPr>
+              <w:br/>
+            </w:r>
+            <w:r>
+              <w:rPr>
+                <w:b/>
+                <w:bCs/>
+                <w:sz w:val="24"/>
+                <w:szCs w:val="24"/>
+              </w:rPr>
+              <w:t xml:space="preserve">BUT Still </w:t>
+            </w:r>
+            <w:r>
+              <w:rPr>
+                <w:sz w:val="24"/>
+                <w:szCs w:val="24"/>
+              </w:rPr>
+              <w:t>pulled his weight and even with disengagement at certain parts of the course there was considerable effort near the end</w:t>
+            </w:r>
+          </w:p>
+        </w:tc>
+        <w:tc>
+          <w:tcPr>
+            <w:tcW w:w="1265" w:type="dxa"/>
+            <w:tcBorders>
+              <w:top w:val="single" w:sz="4" w:space="0" w:color="auto"/>
+              <w:left w:val="single" w:sz="4" w:space="0" w:color="auto"/>
+              <w:bottom w:val="single" w:sz="4" w:space="0" w:color="auto"/>
+              <w:right w:val="single" w:sz="4" w:space="0" w:color="auto"/>
+            </w:tcBorders>
+            <w:noWrap/>
+            <w:vAlign w:val="center"/>
+          </w:tcPr>
+          <w:p>
+            <w:pPr>
+              <w:spacing w:after="0" w:line="240" w:lineRule="auto"/>
+              <w:jc w:val="center"/>
+              <w:rPr>
+                <w:rFonts w:ascii="Arial" w:eastAsia="Times New Roman" w:hAnsi="Arial" w:cs="Arial"/>
+                <w:sz w:val="36"/>
+                <w:szCs w:val="36"/>
+              </w:rPr>
+            </w:pPr>
+            <w:r>
+              <w:rPr>
+                <w:rFonts w:ascii="Arial" w:eastAsia="Times New Roman" w:hAnsi="Arial" w:cs="Arial"/>
+                <w:sz w:val="36"/>
+                <w:szCs w:val="36"/>
+              </w:rPr>
+              <w:t>9</w:t>
+            </w:r>
+            <w:r>
+              <w:rPr>
+                <w:rFonts w:ascii="Arial" w:eastAsia="Times New Roman" w:hAnsi="Arial" w:cs="Arial"/>
+                <w:sz w:val="36"/>
+                <w:szCs w:val="36"/>
+              </w:rPr>
+              <w:t>2</w:t>
             </w:r>
           </w:p>
         </w:tc>

</xml_diff>